<commit_message>
Faltaba de enviar un documento, sobre uno de los laboratorios
</commit_message>
<xml_diff>
--- a/Laboratorio2_C25713/Laboratorio2B/C25713_Josue_Laboratorio2B.docx
+++ b/Laboratorio2_C25713/Laboratorio2B/C25713_Josue_Laboratorio2B.docx
@@ -3722,6 +3722,7 @@
       <w:pPr>
         <w:pStyle w:val="NormalWeb"/>
         <w:spacing w:before="0" w:beforeAutospacing="0" w:after="0" w:afterAutospacing="0" w:line="480" w:lineRule="atLeast"/>
+        <w:ind w:left="720" w:hanging="720"/>
         <w:rPr>
           <w:color w:val="000000"/>
           <w:lang w:val="en-US"/>
@@ -3780,6 +3781,15 @@
     </w:p>
     <w:p>
       <w:pPr>
+        <w:rPr>
+          <w:rFonts w:ascii="Times New Roman" w:hAnsi="Times New Roman" w:cs="Times New Roman"/>
+          <w:color w:val="000000" w:themeColor="text1"/>
+          <w:lang w:val="en-US"/>
+        </w:rPr>
+      </w:pPr>
+    </w:p>
+    <w:p>
+      <w:pPr>
         <w:pStyle w:val="NormalWeb"/>
         <w:spacing w:before="0" w:beforeAutospacing="0" w:after="0" w:afterAutospacing="0" w:line="480" w:lineRule="atLeast"/>
         <w:rPr>
@@ -3794,14 +3804,14 @@
           <w:color w:val="000000"/>
           <w:lang w:val="en-US"/>
         </w:rPr>
-        <w:t>Closures - JavaScript | MDN</w:t>
+        <w:t>Document Object Model (DOM) - Web APIs | MDN</w:t>
       </w:r>
       <w:r>
         <w:rPr>
           <w:color w:val="000000"/>
           <w:lang w:val="en-US"/>
         </w:rPr>
-        <w:t>. (2025, 2 julio).</w:t>
+        <w:t>. (2025, 7 noviembre).</w:t>
       </w:r>
       <w:r>
         <w:rPr>
@@ -3812,74 +3822,6 @@
         <w:t> </w:t>
       </w:r>
       <w:hyperlink r:id="rId8" w:history="1">
-        <w:r>
-          <w:rPr>
-            <w:rStyle w:val="Hipervnculo"/>
-            <w:lang w:val="en-US"/>
-          </w:rPr>
-          <w:t>https://developer.mozilla.org/es/docs/Web/JavaScript/Guide/Closures</w:t>
-        </w:r>
-      </w:hyperlink>
-      <w:r>
-        <w:rPr>
-          <w:rStyle w:val="url"/>
-          <w:color w:val="000000"/>
-          <w:lang w:val="en-US"/>
-        </w:rPr>
-        <w:t>?</w:t>
-      </w:r>
-      <w:r>
-        <w:rPr>
-          <w:rStyle w:val="url"/>
-          <w:color w:val="000000"/>
-          <w:lang w:val="en-US"/>
-        </w:rPr>
-        <w:t xml:space="preserve"> </w:t>
-      </w:r>
-    </w:p>
-    <w:p>
-      <w:pPr>
-        <w:rPr>
-          <w:rFonts w:ascii="Times New Roman" w:hAnsi="Times New Roman" w:cs="Times New Roman"/>
-          <w:color w:val="000000" w:themeColor="text1"/>
-          <w:lang w:val="en-US"/>
-        </w:rPr>
-      </w:pPr>
-    </w:p>
-    <w:p>
-      <w:pPr>
-        <w:pStyle w:val="NormalWeb"/>
-        <w:spacing w:before="0" w:beforeAutospacing="0" w:after="0" w:afterAutospacing="0" w:line="480" w:lineRule="atLeast"/>
-        <w:rPr>
-          <w:color w:val="000000"/>
-          <w:lang w:val="en-US"/>
-        </w:rPr>
-      </w:pPr>
-      <w:r>
-        <w:rPr>
-          <w:i/>
-          <w:iCs/>
-          <w:color w:val="000000"/>
-          <w:lang w:val="en-US"/>
-        </w:rPr>
-        <w:t>Document Object Model (DOM) - Web APIs | MDN</w:t>
-      </w:r>
-      <w:r>
-        <w:rPr>
-          <w:color w:val="000000"/>
-          <w:lang w:val="en-US"/>
-        </w:rPr>
-        <w:t>. (2025, 7 noviembre).</w:t>
-      </w:r>
-      <w:r>
-        <w:rPr>
-          <w:rStyle w:val="apple-converted-space"/>
-          <w:color w:val="000000"/>
-          <w:lang w:val="en-US"/>
-        </w:rPr>
-        <w:t> </w:t>
-      </w:r>
-      <w:hyperlink r:id="rId9" w:history="1">
         <w:r>
           <w:rPr>
             <w:rStyle w:val="Hipervnculo"/>
@@ -3968,7 +3910,7 @@
         </w:rPr>
         <w:t> </w:t>
       </w:r>
-      <w:hyperlink r:id="rId10" w:history="1">
+      <w:hyperlink r:id="rId9" w:history="1">
         <w:r>
           <w:rPr>
             <w:rStyle w:val="Hipervnculo"/>
@@ -4048,7 +3990,7 @@
         </w:rPr>
         <w:t> </w:t>
       </w:r>
-      <w:hyperlink r:id="rId11" w:history="1">
+      <w:hyperlink r:id="rId10" w:history="1">
         <w:r>
           <w:rPr>
             <w:rStyle w:val="Hipervnculo"/>
@@ -4108,7 +4050,7 @@
         </w:rPr>
         <w:t> </w:t>
       </w:r>
-      <w:hyperlink r:id="rId12" w:history="1">
+      <w:hyperlink r:id="rId11" w:history="1">
         <w:r>
           <w:rPr>
             <w:rStyle w:val="Hipervnculo"/>
@@ -4167,7 +4109,7 @@
         </w:rPr>
         <w:t> </w:t>
       </w:r>
-      <w:hyperlink r:id="rId13" w:history="1">
+      <w:hyperlink r:id="rId12" w:history="1">
         <w:r>
           <w:rPr>
             <w:rStyle w:val="Hipervnculo"/>
@@ -4226,7 +4168,7 @@
         </w:rPr>
         <w:t> </w:t>
       </w:r>
-      <w:hyperlink r:id="rId14" w:history="1">
+      <w:hyperlink r:id="rId13" w:history="1">
         <w:r>
           <w:rPr>
             <w:rStyle w:val="Hipervnculo"/>
@@ -4287,7 +4229,6 @@
           <w:color w:val="000000"/>
           <w:lang w:val="en-US"/>
         </w:rPr>
-        <w:lastRenderedPageBreak/>
         <w:t>Using promises - JavaScript | MDN</w:t>
       </w:r>
       <w:r>
@@ -4305,7 +4246,7 @@
         </w:rPr>
         <w:t> </w:t>
       </w:r>
-      <w:hyperlink r:id="rId15" w:history="1">
+      <w:hyperlink r:id="rId14" w:history="1">
         <w:r>
           <w:rPr>
             <w:rStyle w:val="Hipervnculo"/>
@@ -4363,7 +4304,7 @@
         </w:rPr>
         <w:t> </w:t>
       </w:r>
-      <w:hyperlink r:id="rId16" w:history="1">
+      <w:hyperlink r:id="rId15" w:history="1">
         <w:r>
           <w:rPr>
             <w:rStyle w:val="Hipervnculo"/>

</xml_diff>